<commit_message>
casos de usos y requerimientos
</commit_message>
<xml_diff>
--- a/ComponentesMetodologicos/Requerimientos_Funcionales_CEREBRUM_CRUD_CORREGIDO.docx
+++ b/ComponentesMetodologicos/Requerimientos_Funcionales_CEREBRUM_CRUD_CORREGIDO.docx
@@ -4,7 +4,7 @@
   <w:body>
     <w:p>
       <w:pPr>
-        <w:pStyle w:val="Heading1"/>
+        <w:pStyle w:val="Ttulo1"/>
         <w:rPr>
           <w:lang w:val="es-CO"/>
         </w:rPr>
@@ -1546,7 +1546,21 @@
           <w:lang w:val="es-CO"/>
         </w:rPr>
         <w:br/>
-        <w:t>Los administradores y profesores autorizados podrán Crear, consultar, actualizar y eliminar  preguntas.</w:t>
+        <w:t xml:space="preserve">Los administradores y profesores autorizados podrán Crear, consultar, actualizar y </w:t>
+      </w:r>
+      <w:proofErr w:type="gramStart"/>
+      <w:r>
+        <w:rPr>
+          <w:lang w:val="es-CO"/>
+        </w:rPr>
+        <w:t>eliminar  preguntas</w:t>
+      </w:r>
+      <w:proofErr w:type="gramEnd"/>
+      <w:r>
+        <w:rPr>
+          <w:lang w:val="es-CO"/>
+        </w:rPr>
+        <w:t>.</w:t>
       </w:r>
       <w:r>
         <w:rPr>
@@ -1574,7 +1588,21 @@
           <w:lang w:val="es-CO"/>
         </w:rPr>
         <w:br/>
-        <w:t>Los administradores podrán Crear, consultar, actualizar y eliminar  materias.</w:t>
+        <w:t xml:space="preserve">Los administradores podrán Crear, consultar, actualizar y </w:t>
+      </w:r>
+      <w:proofErr w:type="gramStart"/>
+      <w:r>
+        <w:rPr>
+          <w:lang w:val="es-CO"/>
+        </w:rPr>
+        <w:t>eliminar  materias</w:t>
+      </w:r>
+      <w:proofErr w:type="gramEnd"/>
+      <w:r>
+        <w:rPr>
+          <w:lang w:val="es-CO"/>
+        </w:rPr>
+        <w:t>.</w:t>
       </w:r>
       <w:r>
         <w:rPr>
@@ -1602,7 +1630,19 @@
           <w:lang w:val="es-CO"/>
         </w:rPr>
         <w:br/>
-        <w:t>Los administradores podrán consultar y eliminar cuentas registradas.</w:t>
+        <w:t xml:space="preserve">Los administradores podrán consultar y </w:t>
+      </w:r>
+      <w:r>
+        <w:rPr>
+          <w:lang w:val="es-CO"/>
+        </w:rPr>
+        <w:t>suspender</w:t>
+      </w:r>
+      <w:r>
+        <w:rPr>
+          <w:lang w:val="es-CO"/>
+        </w:rPr>
+        <w:t xml:space="preserve"> cuentas registradas.</w:t>
       </w:r>
       <w:r>
         <w:rPr>
@@ -1862,7 +1902,7 @@
     <w:lvl w:ilvl="0">
       <w:start w:val="1"/>
       <w:numFmt w:val="bullet"/>
-      <w:pStyle w:val="ListBullet2"/>
+      <w:pStyle w:val="Listaconvietas2"/>
       <w:lvlText w:val=""/>
       <w:lvlJc w:val="left"/>
       <w:pPr>
@@ -1979,7 +2019,7 @@
     <w:lvl w:ilvl="0">
       <w:start w:val="1"/>
       <w:numFmt w:val="decimal"/>
-      <w:pStyle w:val="ListNumber3"/>
+      <w:pStyle w:val="Listaconnmeros3"/>
       <w:lvlText w:val="%1."/>
       <w:lvlJc w:val="left"/>
       <w:pPr>
@@ -2093,7 +2133,7 @@
     <w:lvl w:ilvl="0">
       <w:start w:val="1"/>
       <w:numFmt w:val="bullet"/>
-      <w:pStyle w:val="ListBullet"/>
+      <w:pStyle w:val="Listaconvietas"/>
       <w:lvlText w:val=""/>
       <w:lvlJc w:val="left"/>
       <w:pPr>
@@ -2210,7 +2250,7 @@
     <w:lvl w:ilvl="0">
       <w:start w:val="1"/>
       <w:numFmt w:val="decimal"/>
-      <w:pStyle w:val="ListNumber"/>
+      <w:pStyle w:val="Listaconnmeros"/>
       <w:lvlText w:val="%1."/>
       <w:lvlJc w:val="left"/>
       <w:pPr>
@@ -2324,7 +2364,7 @@
     <w:lvl w:ilvl="0">
       <w:start w:val="1"/>
       <w:numFmt w:val="decimal"/>
-      <w:pStyle w:val="ListNumber2"/>
+      <w:pStyle w:val="Listaconnmeros2"/>
       <w:lvlText w:val="%1."/>
       <w:lvlJc w:val="left"/>
       <w:pPr>
@@ -2438,7 +2478,7 @@
     <w:lvl w:ilvl="0">
       <w:start w:val="1"/>
       <w:numFmt w:val="bullet"/>
-      <w:pStyle w:val="ListBullet3"/>
+      <w:pStyle w:val="Listaconvietas3"/>
       <w:lvlText w:val=""/>
       <w:lvlJc w:val="left"/>
       <w:pPr>
@@ -3088,11 +3128,11 @@
       <w:spacing w:after="200" w:line="276" w:lineRule="auto"/>
     </w:pPr>
   </w:style>
-  <w:style w:type="paragraph" w:styleId="Heading1">
+  <w:style w:type="paragraph" w:styleId="Ttulo1">
     <w:name w:val="heading 1"/>
     <w:basedOn w:val="Normal"/>
     <w:next w:val="Normal"/>
-    <w:link w:val="Heading1Char"/>
+    <w:link w:val="Ttulo1Car"/>
     <w:uiPriority w:val="9"/>
     <w:qFormat/>
     <w:rsid w:val="00FC693F"/>
@@ -3111,11 +3151,11 @@
       <w:szCs w:val="28"/>
     </w:rPr>
   </w:style>
-  <w:style w:type="paragraph" w:styleId="Heading2">
+  <w:style w:type="paragraph" w:styleId="Ttulo2">
     <w:name w:val="heading 2"/>
     <w:basedOn w:val="Normal"/>
     <w:next w:val="Normal"/>
-    <w:link w:val="Heading2Char"/>
+    <w:link w:val="Ttulo2Car"/>
     <w:uiPriority w:val="9"/>
     <w:unhideWhenUsed/>
     <w:qFormat/>
@@ -3135,11 +3175,11 @@
       <w:szCs w:val="26"/>
     </w:rPr>
   </w:style>
-  <w:style w:type="paragraph" w:styleId="Heading3">
+  <w:style w:type="paragraph" w:styleId="Ttulo3">
     <w:name w:val="heading 3"/>
     <w:basedOn w:val="Normal"/>
     <w:next w:val="Normal"/>
-    <w:link w:val="Heading3Char"/>
+    <w:link w:val="Ttulo3Car"/>
     <w:uiPriority w:val="9"/>
     <w:unhideWhenUsed/>
     <w:qFormat/>
@@ -3157,11 +3197,11 @@
       <w:color w:val="4F81BD" w:themeColor="accent1"/>
     </w:rPr>
   </w:style>
-  <w:style w:type="paragraph" w:styleId="Heading4">
+  <w:style w:type="paragraph" w:styleId="Ttulo4">
     <w:name w:val="heading 4"/>
     <w:basedOn w:val="Normal"/>
     <w:next w:val="Normal"/>
-    <w:link w:val="Heading4Char"/>
+    <w:link w:val="Ttulo4Car"/>
     <w:uiPriority w:val="9"/>
     <w:semiHidden/>
     <w:unhideWhenUsed/>
@@ -3182,11 +3222,11 @@
       <w:color w:val="4F81BD" w:themeColor="accent1"/>
     </w:rPr>
   </w:style>
-  <w:style w:type="paragraph" w:styleId="Heading5">
+  <w:style w:type="paragraph" w:styleId="Ttulo5">
     <w:name w:val="heading 5"/>
     <w:basedOn w:val="Normal"/>
     <w:next w:val="Normal"/>
-    <w:link w:val="Heading5Char"/>
+    <w:link w:val="Ttulo5Car"/>
     <w:uiPriority w:val="9"/>
     <w:semiHidden/>
     <w:unhideWhenUsed/>
@@ -3203,11 +3243,11 @@
       <w:color w:val="243F60" w:themeColor="accent1" w:themeShade="7F"/>
     </w:rPr>
   </w:style>
-  <w:style w:type="paragraph" w:styleId="Heading6">
+  <w:style w:type="paragraph" w:styleId="Ttulo6">
     <w:name w:val="heading 6"/>
     <w:basedOn w:val="Normal"/>
     <w:next w:val="Normal"/>
-    <w:link w:val="Heading6Char"/>
+    <w:link w:val="Ttulo6Car"/>
     <w:uiPriority w:val="9"/>
     <w:semiHidden/>
     <w:unhideWhenUsed/>
@@ -3226,11 +3266,11 @@
       <w:color w:val="243F60" w:themeColor="accent1" w:themeShade="7F"/>
     </w:rPr>
   </w:style>
-  <w:style w:type="paragraph" w:styleId="Heading7">
+  <w:style w:type="paragraph" w:styleId="Ttulo7">
     <w:name w:val="heading 7"/>
     <w:basedOn w:val="Normal"/>
     <w:next w:val="Normal"/>
-    <w:link w:val="Heading7Char"/>
+    <w:link w:val="Ttulo7Car"/>
     <w:uiPriority w:val="9"/>
     <w:semiHidden/>
     <w:unhideWhenUsed/>
@@ -3249,11 +3289,11 @@
       <w:color w:val="404040" w:themeColor="text1" w:themeTint="BF"/>
     </w:rPr>
   </w:style>
-  <w:style w:type="paragraph" w:styleId="Heading8">
+  <w:style w:type="paragraph" w:styleId="Ttulo8">
     <w:name w:val="heading 8"/>
     <w:basedOn w:val="Normal"/>
     <w:next w:val="Normal"/>
-    <w:link w:val="Heading8Char"/>
+    <w:link w:val="Ttulo8Car"/>
     <w:uiPriority w:val="9"/>
     <w:semiHidden/>
     <w:unhideWhenUsed/>
@@ -3272,11 +3312,11 @@
       <w:szCs w:val="20"/>
     </w:rPr>
   </w:style>
-  <w:style w:type="paragraph" w:styleId="Heading9">
+  <w:style w:type="paragraph" w:styleId="Ttulo9">
     <w:name w:val="heading 9"/>
     <w:basedOn w:val="Normal"/>
     <w:next w:val="Normal"/>
-    <w:link w:val="Heading9Char"/>
+    <w:link w:val="Ttulo9Car"/>
     <w:uiPriority w:val="9"/>
     <w:semiHidden/>
     <w:unhideWhenUsed/>
@@ -3297,13 +3337,13 @@
       <w:szCs w:val="20"/>
     </w:rPr>
   </w:style>
-  <w:style w:type="character" w:default="1" w:styleId="DefaultParagraphFont">
+  <w:style w:type="character" w:default="1" w:styleId="Fuentedeprrafopredeter">
     <w:name w:val="Default Paragraph Font"/>
     <w:uiPriority w:val="1"/>
     <w:semiHidden/>
     <w:unhideWhenUsed/>
   </w:style>
-  <w:style w:type="table" w:default="1" w:styleId="TableNormal">
+  <w:style w:type="table" w:default="1" w:styleId="Tablanormal">
     <w:name w:val="Normal Table"/>
     <w:uiPriority w:val="99"/>
     <w:semiHidden/>
@@ -3318,32 +3358,32 @@
       </w:tblCellMar>
     </w:tblPr>
   </w:style>
-  <w:style w:type="numbering" w:default="1" w:styleId="NoList">
+  <w:style w:type="numbering" w:default="1" w:styleId="Sinlista">
     <w:name w:val="No List"/>
     <w:uiPriority w:val="99"/>
     <w:semiHidden/>
     <w:unhideWhenUsed/>
   </w:style>
-  <w:style w:type="character" w:customStyle="1" w:styleId="HeaderChar">
-    <w:name w:val="Header Char"/>
-    <w:basedOn w:val="DefaultParagraphFont"/>
-    <w:link w:val="Header"/>
+  <w:style w:type="character" w:customStyle="1" w:styleId="EncabezadoCar">
+    <w:name w:val="Encabezado Car"/>
+    <w:basedOn w:val="Fuentedeprrafopredeter"/>
+    <w:link w:val="Encabezado"/>
     <w:uiPriority w:val="99"/>
     <w:qFormat/>
     <w:rsid w:val="00E618BF"/>
   </w:style>
-  <w:style w:type="character" w:customStyle="1" w:styleId="FooterChar">
-    <w:name w:val="Footer Char"/>
-    <w:basedOn w:val="DefaultParagraphFont"/>
-    <w:link w:val="Footer"/>
+  <w:style w:type="character" w:customStyle="1" w:styleId="PiedepginaCar">
+    <w:name w:val="Pie de página Car"/>
+    <w:basedOn w:val="Fuentedeprrafopredeter"/>
+    <w:link w:val="Piedepgina"/>
     <w:uiPriority w:val="99"/>
     <w:qFormat/>
     <w:rsid w:val="00E618BF"/>
   </w:style>
-  <w:style w:type="character" w:customStyle="1" w:styleId="Heading1Char">
-    <w:name w:val="Heading 1 Char"/>
-    <w:basedOn w:val="DefaultParagraphFont"/>
-    <w:link w:val="Heading1"/>
+  <w:style w:type="character" w:customStyle="1" w:styleId="Ttulo1Car">
+    <w:name w:val="Título 1 Car"/>
+    <w:basedOn w:val="Fuentedeprrafopredeter"/>
+    <w:link w:val="Ttulo1"/>
     <w:uiPriority w:val="9"/>
     <w:qFormat/>
     <w:rsid w:val="00FC693F"/>
@@ -3356,10 +3396,10 @@
       <w:szCs w:val="28"/>
     </w:rPr>
   </w:style>
-  <w:style w:type="character" w:customStyle="1" w:styleId="Heading2Char">
-    <w:name w:val="Heading 2 Char"/>
-    <w:basedOn w:val="DefaultParagraphFont"/>
-    <w:link w:val="Heading2"/>
+  <w:style w:type="character" w:customStyle="1" w:styleId="Ttulo2Car">
+    <w:name w:val="Título 2 Car"/>
+    <w:basedOn w:val="Fuentedeprrafopredeter"/>
+    <w:link w:val="Ttulo2"/>
     <w:uiPriority w:val="9"/>
     <w:qFormat/>
     <w:rsid w:val="00FC693F"/>
@@ -3372,10 +3412,10 @@
       <w:szCs w:val="26"/>
     </w:rPr>
   </w:style>
-  <w:style w:type="character" w:customStyle="1" w:styleId="Heading3Char">
-    <w:name w:val="Heading 3 Char"/>
-    <w:basedOn w:val="DefaultParagraphFont"/>
-    <w:link w:val="Heading3"/>
+  <w:style w:type="character" w:customStyle="1" w:styleId="Ttulo3Car">
+    <w:name w:val="Título 3 Car"/>
+    <w:basedOn w:val="Fuentedeprrafopredeter"/>
+    <w:link w:val="Ttulo3"/>
     <w:uiPriority w:val="9"/>
     <w:qFormat/>
     <w:rsid w:val="00FC693F"/>
@@ -3386,10 +3426,10 @@
       <w:color w:val="4F81BD" w:themeColor="accent1"/>
     </w:rPr>
   </w:style>
-  <w:style w:type="character" w:customStyle="1" w:styleId="TitleChar">
-    <w:name w:val="Title Char"/>
-    <w:basedOn w:val="DefaultParagraphFont"/>
-    <w:link w:val="Title"/>
+  <w:style w:type="character" w:customStyle="1" w:styleId="TtuloCar">
+    <w:name w:val="Título Car"/>
+    <w:basedOn w:val="Fuentedeprrafopredeter"/>
+    <w:link w:val="Ttulo"/>
     <w:uiPriority w:val="10"/>
     <w:qFormat/>
     <w:rsid w:val="00FC693F"/>
@@ -3402,10 +3442,10 @@
       <w:szCs w:val="52"/>
     </w:rPr>
   </w:style>
-  <w:style w:type="character" w:customStyle="1" w:styleId="SubtitleChar">
-    <w:name w:val="Subtitle Char"/>
-    <w:basedOn w:val="DefaultParagraphFont"/>
-    <w:link w:val="Subtitle"/>
+  <w:style w:type="character" w:customStyle="1" w:styleId="SubttuloCar">
+    <w:name w:val="Subtítulo Car"/>
+    <w:basedOn w:val="Fuentedeprrafopredeter"/>
+    <w:link w:val="Subttulo"/>
     <w:uiPriority w:val="11"/>
     <w:qFormat/>
     <w:rsid w:val="00FC693F"/>
@@ -3419,26 +3459,26 @@
       <w:szCs w:val="24"/>
     </w:rPr>
   </w:style>
-  <w:style w:type="character" w:customStyle="1" w:styleId="BodyTextChar">
-    <w:name w:val="Body Text Char"/>
-    <w:basedOn w:val="DefaultParagraphFont"/>
-    <w:link w:val="BodyText"/>
+  <w:style w:type="character" w:customStyle="1" w:styleId="TextoindependienteCar">
+    <w:name w:val="Texto independiente Car"/>
+    <w:basedOn w:val="Fuentedeprrafopredeter"/>
+    <w:link w:val="Textoindependiente"/>
     <w:uiPriority w:val="99"/>
     <w:qFormat/>
     <w:rsid w:val="00AA1D8D"/>
   </w:style>
-  <w:style w:type="character" w:customStyle="1" w:styleId="BodyText2Char">
-    <w:name w:val="Body Text 2 Char"/>
-    <w:basedOn w:val="DefaultParagraphFont"/>
-    <w:link w:val="BodyText2"/>
+  <w:style w:type="character" w:customStyle="1" w:styleId="Textoindependiente2Car">
+    <w:name w:val="Texto independiente 2 Car"/>
+    <w:basedOn w:val="Fuentedeprrafopredeter"/>
+    <w:link w:val="Textoindependiente2"/>
     <w:uiPriority w:val="99"/>
     <w:qFormat/>
     <w:rsid w:val="00AA1D8D"/>
   </w:style>
-  <w:style w:type="character" w:customStyle="1" w:styleId="BodyText3Char">
-    <w:name w:val="Body Text 3 Char"/>
-    <w:basedOn w:val="DefaultParagraphFont"/>
-    <w:link w:val="BodyText3"/>
+  <w:style w:type="character" w:customStyle="1" w:styleId="Textoindependiente3Car">
+    <w:name w:val="Texto independiente 3 Car"/>
+    <w:basedOn w:val="Fuentedeprrafopredeter"/>
+    <w:link w:val="Textoindependiente3"/>
     <w:uiPriority w:val="99"/>
     <w:qFormat/>
     <w:rsid w:val="00AA1D8D"/>
@@ -3447,10 +3487,10 @@
       <w:szCs w:val="16"/>
     </w:rPr>
   </w:style>
-  <w:style w:type="character" w:customStyle="1" w:styleId="MacroTextChar">
-    <w:name w:val="Macro Text Char"/>
-    <w:basedOn w:val="DefaultParagraphFont"/>
-    <w:link w:val="MacroText"/>
+  <w:style w:type="character" w:customStyle="1" w:styleId="TextomacroCar">
+    <w:name w:val="Texto macro Car"/>
+    <w:basedOn w:val="Fuentedeprrafopredeter"/>
+    <w:link w:val="Textomacro"/>
     <w:uiPriority w:val="99"/>
     <w:qFormat/>
     <w:rsid w:val="0029639D"/>
@@ -3460,10 +3500,10 @@
       <w:szCs w:val="20"/>
     </w:rPr>
   </w:style>
-  <w:style w:type="character" w:customStyle="1" w:styleId="QuoteChar">
-    <w:name w:val="Quote Char"/>
-    <w:basedOn w:val="DefaultParagraphFont"/>
-    <w:link w:val="Quote"/>
+  <w:style w:type="character" w:customStyle="1" w:styleId="CitaCar">
+    <w:name w:val="Cita Car"/>
+    <w:basedOn w:val="Fuentedeprrafopredeter"/>
+    <w:link w:val="Cita"/>
     <w:uiPriority w:val="29"/>
     <w:qFormat/>
     <w:rsid w:val="00FC693F"/>
@@ -3473,10 +3513,10 @@
       <w:color w:val="000000" w:themeColor="text1"/>
     </w:rPr>
   </w:style>
-  <w:style w:type="character" w:customStyle="1" w:styleId="Heading4Char">
-    <w:name w:val="Heading 4 Char"/>
-    <w:basedOn w:val="DefaultParagraphFont"/>
-    <w:link w:val="Heading4"/>
+  <w:style w:type="character" w:customStyle="1" w:styleId="Ttulo4Car">
+    <w:name w:val="Título 4 Car"/>
+    <w:basedOn w:val="Fuentedeprrafopredeter"/>
+    <w:link w:val="Ttulo4"/>
     <w:uiPriority w:val="9"/>
     <w:semiHidden/>
     <w:qFormat/>
@@ -3490,10 +3530,10 @@
       <w:color w:val="4F81BD" w:themeColor="accent1"/>
     </w:rPr>
   </w:style>
-  <w:style w:type="character" w:customStyle="1" w:styleId="Heading5Char">
-    <w:name w:val="Heading 5 Char"/>
-    <w:basedOn w:val="DefaultParagraphFont"/>
-    <w:link w:val="Heading5"/>
+  <w:style w:type="character" w:customStyle="1" w:styleId="Ttulo5Car">
+    <w:name w:val="Título 5 Car"/>
+    <w:basedOn w:val="Fuentedeprrafopredeter"/>
+    <w:link w:val="Ttulo5"/>
     <w:uiPriority w:val="9"/>
     <w:semiHidden/>
     <w:qFormat/>
@@ -3503,10 +3543,10 @@
       <w:color w:val="243F60" w:themeColor="accent1" w:themeShade="7F"/>
     </w:rPr>
   </w:style>
-  <w:style w:type="character" w:customStyle="1" w:styleId="Heading6Char">
-    <w:name w:val="Heading 6 Char"/>
-    <w:basedOn w:val="DefaultParagraphFont"/>
-    <w:link w:val="Heading6"/>
+  <w:style w:type="character" w:customStyle="1" w:styleId="Ttulo6Car">
+    <w:name w:val="Título 6 Car"/>
+    <w:basedOn w:val="Fuentedeprrafopredeter"/>
+    <w:link w:val="Ttulo6"/>
     <w:uiPriority w:val="9"/>
     <w:semiHidden/>
     <w:qFormat/>
@@ -3518,10 +3558,10 @@
       <w:color w:val="243F60" w:themeColor="accent1" w:themeShade="7F"/>
     </w:rPr>
   </w:style>
-  <w:style w:type="character" w:customStyle="1" w:styleId="Heading7Char">
-    <w:name w:val="Heading 7 Char"/>
-    <w:basedOn w:val="DefaultParagraphFont"/>
-    <w:link w:val="Heading7"/>
+  <w:style w:type="character" w:customStyle="1" w:styleId="Ttulo7Car">
+    <w:name w:val="Título 7 Car"/>
+    <w:basedOn w:val="Fuentedeprrafopredeter"/>
+    <w:link w:val="Ttulo7"/>
     <w:uiPriority w:val="9"/>
     <w:semiHidden/>
     <w:qFormat/>
@@ -3533,10 +3573,10 @@
       <w:color w:val="404040" w:themeColor="text1" w:themeTint="BF"/>
     </w:rPr>
   </w:style>
-  <w:style w:type="character" w:customStyle="1" w:styleId="Heading8Char">
-    <w:name w:val="Heading 8 Char"/>
-    <w:basedOn w:val="DefaultParagraphFont"/>
-    <w:link w:val="Heading8"/>
+  <w:style w:type="character" w:customStyle="1" w:styleId="Ttulo8Car">
+    <w:name w:val="Título 8 Car"/>
+    <w:basedOn w:val="Fuentedeprrafopredeter"/>
+    <w:link w:val="Ttulo8"/>
     <w:uiPriority w:val="9"/>
     <w:semiHidden/>
     <w:qFormat/>
@@ -3548,10 +3588,10 @@
       <w:szCs w:val="20"/>
     </w:rPr>
   </w:style>
-  <w:style w:type="character" w:customStyle="1" w:styleId="Heading9Char">
-    <w:name w:val="Heading 9 Char"/>
-    <w:basedOn w:val="DefaultParagraphFont"/>
-    <w:link w:val="Heading9"/>
+  <w:style w:type="character" w:customStyle="1" w:styleId="Ttulo9Car">
+    <w:name w:val="Título 9 Car"/>
+    <w:basedOn w:val="Fuentedeprrafopredeter"/>
+    <w:link w:val="Ttulo9"/>
     <w:uiPriority w:val="9"/>
     <w:semiHidden/>
     <w:qFormat/>
@@ -3565,9 +3605,9 @@
       <w:szCs w:val="20"/>
     </w:rPr>
   </w:style>
-  <w:style w:type="character" w:styleId="Strong">
+  <w:style w:type="character" w:styleId="Textoennegrita">
     <w:name w:val="Strong"/>
-    <w:basedOn w:val="DefaultParagraphFont"/>
+    <w:basedOn w:val="Fuentedeprrafopredeter"/>
     <w:uiPriority w:val="22"/>
     <w:qFormat/>
     <w:rsid w:val="00FC693F"/>
@@ -3576,9 +3616,9 @@
       <w:bCs/>
     </w:rPr>
   </w:style>
-  <w:style w:type="character" w:styleId="Emphasis">
+  <w:style w:type="character" w:styleId="nfasis">
     <w:name w:val="Emphasis"/>
-    <w:basedOn w:val="DefaultParagraphFont"/>
+    <w:basedOn w:val="Fuentedeprrafopredeter"/>
     <w:uiPriority w:val="20"/>
     <w:qFormat/>
     <w:rsid w:val="00FC693F"/>
@@ -3587,10 +3627,10 @@
       <w:iCs/>
     </w:rPr>
   </w:style>
-  <w:style w:type="character" w:customStyle="1" w:styleId="IntenseQuoteChar">
-    <w:name w:val="Intense Quote Char"/>
-    <w:basedOn w:val="DefaultParagraphFont"/>
-    <w:link w:val="IntenseQuote"/>
+  <w:style w:type="character" w:customStyle="1" w:styleId="CitadestacadaCar">
+    <w:name w:val="Cita destacada Car"/>
+    <w:basedOn w:val="Fuentedeprrafopredeter"/>
+    <w:link w:val="Citadestacada"/>
     <w:uiPriority w:val="30"/>
     <w:qFormat/>
     <w:rsid w:val="00FC693F"/>
@@ -3602,9 +3642,9 @@
       <w:color w:val="4F81BD" w:themeColor="accent1"/>
     </w:rPr>
   </w:style>
-  <w:style w:type="character" w:styleId="SubtleEmphasis">
+  <w:style w:type="character" w:styleId="nfasissutil">
     <w:name w:val="Subtle Emphasis"/>
-    <w:basedOn w:val="DefaultParagraphFont"/>
+    <w:basedOn w:val="Fuentedeprrafopredeter"/>
     <w:uiPriority w:val="19"/>
     <w:qFormat/>
     <w:rsid w:val="00FC693F"/>
@@ -3614,9 +3654,9 @@
       <w:color w:val="808080" w:themeColor="text1" w:themeTint="7F"/>
     </w:rPr>
   </w:style>
-  <w:style w:type="character" w:styleId="IntenseEmphasis">
+  <w:style w:type="character" w:styleId="nfasisintenso">
     <w:name w:val="Intense Emphasis"/>
-    <w:basedOn w:val="DefaultParagraphFont"/>
+    <w:basedOn w:val="Fuentedeprrafopredeter"/>
     <w:uiPriority w:val="21"/>
     <w:qFormat/>
     <w:rsid w:val="00FC693F"/>
@@ -3628,9 +3668,9 @@
       <w:color w:val="4F81BD" w:themeColor="accent1"/>
     </w:rPr>
   </w:style>
-  <w:style w:type="character" w:styleId="SubtleReference">
+  <w:style w:type="character" w:styleId="Referenciasutil">
     <w:name w:val="Subtle Reference"/>
-    <w:basedOn w:val="DefaultParagraphFont"/>
+    <w:basedOn w:val="Fuentedeprrafopredeter"/>
     <w:uiPriority w:val="31"/>
     <w:qFormat/>
     <w:rsid w:val="00FC693F"/>
@@ -3640,9 +3680,9 @@
       <w:u w:val="single"/>
     </w:rPr>
   </w:style>
-  <w:style w:type="character" w:styleId="IntenseReference">
+  <w:style w:type="character" w:styleId="Referenciaintensa">
     <w:name w:val="Intense Reference"/>
-    <w:basedOn w:val="DefaultParagraphFont"/>
+    <w:basedOn w:val="Fuentedeprrafopredeter"/>
     <w:uiPriority w:val="32"/>
     <w:qFormat/>
     <w:rsid w:val="00FC693F"/>
@@ -3655,9 +3695,9 @@
       <w:u w:val="single"/>
     </w:rPr>
   </w:style>
-  <w:style w:type="character" w:styleId="BookTitle">
+  <w:style w:type="character" w:styleId="Ttulodellibro">
     <w:name w:val="Book Title"/>
-    <w:basedOn w:val="DefaultParagraphFont"/>
+    <w:basedOn w:val="Fuentedeprrafopredeter"/>
     <w:uiPriority w:val="33"/>
     <w:qFormat/>
     <w:rsid w:val="00FC693F"/>
@@ -3668,10 +3708,10 @@
       <w:spacing w:val="5"/>
     </w:rPr>
   </w:style>
-  <w:style w:type="paragraph" w:customStyle="1" w:styleId="Ttulo">
-    <w:name w:val="Título"/>
+  <w:style w:type="paragraph" w:customStyle="1" w:styleId="Ttulo10">
+    <w:name w:val="Título1"/>
     <w:basedOn w:val="Normal"/>
-    <w:next w:val="BodyText"/>
+    <w:next w:val="Textoindependiente"/>
     <w:qFormat/>
     <w:pPr>
       <w:keepNext/>
@@ -3683,10 +3723,10 @@
       <w:szCs w:val="28"/>
     </w:rPr>
   </w:style>
-  <w:style w:type="paragraph" w:styleId="BodyText">
+  <w:style w:type="paragraph" w:styleId="Textoindependiente">
     <w:name w:val="Body Text"/>
     <w:basedOn w:val="Normal"/>
-    <w:link w:val="BodyTextChar"/>
+    <w:link w:val="TextoindependienteCar"/>
     <w:uiPriority w:val="99"/>
     <w:unhideWhenUsed/>
     <w:rsid w:val="00AA1D8D"/>
@@ -3694,7 +3734,7 @@
       <w:spacing w:after="120"/>
     </w:pPr>
   </w:style>
-  <w:style w:type="paragraph" w:styleId="List">
+  <w:style w:type="paragraph" w:styleId="Lista">
     <w:name w:val="List"/>
     <w:basedOn w:val="Normal"/>
     <w:uiPriority w:val="99"/>
@@ -3705,7 +3745,7 @@
       <w:contextualSpacing/>
     </w:pPr>
   </w:style>
-  <w:style w:type="paragraph" w:styleId="Caption">
+  <w:style w:type="paragraph" w:styleId="Descripcin">
     <w:name w:val="caption"/>
     <w:basedOn w:val="Normal"/>
     <w:next w:val="Normal"/>
@@ -3741,10 +3781,10 @@
     <w:basedOn w:val="Normal"/>
     <w:qFormat/>
   </w:style>
-  <w:style w:type="paragraph" w:styleId="Header">
+  <w:style w:type="paragraph" w:styleId="Encabezado">
     <w:name w:val="header"/>
     <w:basedOn w:val="Normal"/>
-    <w:link w:val="HeaderChar"/>
+    <w:link w:val="EncabezadoCar"/>
     <w:uiPriority w:val="99"/>
     <w:unhideWhenUsed/>
     <w:rsid w:val="00E618BF"/>
@@ -3756,10 +3796,10 @@
       <w:spacing w:after="0" w:line="240" w:lineRule="auto"/>
     </w:pPr>
   </w:style>
-  <w:style w:type="paragraph" w:styleId="Footer">
+  <w:style w:type="paragraph" w:styleId="Piedepgina">
     <w:name w:val="footer"/>
     <w:basedOn w:val="Normal"/>
-    <w:link w:val="FooterChar"/>
+    <w:link w:val="PiedepginaCar"/>
     <w:uiPriority w:val="99"/>
     <w:unhideWhenUsed/>
     <w:rsid w:val="00E618BF"/>
@@ -3771,17 +3811,17 @@
       <w:spacing w:after="0" w:line="240" w:lineRule="auto"/>
     </w:pPr>
   </w:style>
-  <w:style w:type="paragraph" w:styleId="NoSpacing">
+  <w:style w:type="paragraph" w:styleId="Sinespaciado">
     <w:name w:val="No Spacing"/>
     <w:uiPriority w:val="1"/>
     <w:qFormat/>
     <w:rsid w:val="00FC693F"/>
   </w:style>
-  <w:style w:type="paragraph" w:styleId="Title">
+  <w:style w:type="paragraph" w:styleId="Ttulo">
     <w:name w:val="Title"/>
     <w:basedOn w:val="Normal"/>
     <w:next w:val="Normal"/>
-    <w:link w:val="TitleChar"/>
+    <w:link w:val="TtuloCar"/>
     <w:uiPriority w:val="10"/>
     <w:qFormat/>
     <w:rsid w:val="00FC693F"/>
@@ -3801,11 +3841,11 @@
       <w:szCs w:val="52"/>
     </w:rPr>
   </w:style>
-  <w:style w:type="paragraph" w:styleId="Subtitle">
+  <w:style w:type="paragraph" w:styleId="Subttulo">
     <w:name w:val="Subtitle"/>
     <w:basedOn w:val="Normal"/>
     <w:next w:val="Normal"/>
-    <w:link w:val="SubtitleChar"/>
+    <w:link w:val="SubttuloCar"/>
     <w:uiPriority w:val="11"/>
     <w:qFormat/>
     <w:rsid w:val="00FC693F"/>
@@ -3819,7 +3859,7 @@
       <w:szCs w:val="24"/>
     </w:rPr>
   </w:style>
-  <w:style w:type="paragraph" w:styleId="ListParagraph">
+  <w:style w:type="paragraph" w:styleId="Prrafodelista">
     <w:name w:val="List Paragraph"/>
     <w:basedOn w:val="Normal"/>
     <w:uiPriority w:val="34"/>
@@ -3830,10 +3870,10 @@
       <w:contextualSpacing/>
     </w:pPr>
   </w:style>
-  <w:style w:type="paragraph" w:styleId="BodyText2">
+  <w:style w:type="paragraph" w:styleId="Textoindependiente2">
     <w:name w:val="Body Text 2"/>
     <w:basedOn w:val="Normal"/>
-    <w:link w:val="BodyText2Char"/>
+    <w:link w:val="Textoindependiente2Car"/>
     <w:uiPriority w:val="99"/>
     <w:unhideWhenUsed/>
     <w:qFormat/>
@@ -3842,10 +3882,10 @@
       <w:spacing w:after="120" w:line="480" w:lineRule="auto"/>
     </w:pPr>
   </w:style>
-  <w:style w:type="paragraph" w:styleId="BodyText3">
+  <w:style w:type="paragraph" w:styleId="Textoindependiente3">
     <w:name w:val="Body Text 3"/>
     <w:basedOn w:val="Normal"/>
-    <w:link w:val="BodyText3Char"/>
+    <w:link w:val="Textoindependiente3Car"/>
     <w:uiPriority w:val="99"/>
     <w:unhideWhenUsed/>
     <w:qFormat/>
@@ -3858,7 +3898,7 @@
       <w:szCs w:val="16"/>
     </w:rPr>
   </w:style>
-  <w:style w:type="paragraph" w:styleId="List2">
+  <w:style w:type="paragraph" w:styleId="Lista2">
     <w:name w:val="List 2"/>
     <w:basedOn w:val="Normal"/>
     <w:uiPriority w:val="99"/>
@@ -3870,7 +3910,7 @@
       <w:contextualSpacing/>
     </w:pPr>
   </w:style>
-  <w:style w:type="paragraph" w:styleId="List3">
+  <w:style w:type="paragraph" w:styleId="Lista3">
     <w:name w:val="List 3"/>
     <w:basedOn w:val="Normal"/>
     <w:uiPriority w:val="99"/>
@@ -3882,7 +3922,7 @@
       <w:contextualSpacing/>
     </w:pPr>
   </w:style>
-  <w:style w:type="paragraph" w:styleId="ListBullet">
+  <w:style w:type="paragraph" w:styleId="Listaconvietas">
     <w:name w:val="List Bullet"/>
     <w:basedOn w:val="Normal"/>
     <w:uiPriority w:val="99"/>
@@ -3895,7 +3935,7 @@
       <w:contextualSpacing/>
     </w:pPr>
   </w:style>
-  <w:style w:type="paragraph" w:styleId="ListBullet2">
+  <w:style w:type="paragraph" w:styleId="Listaconvietas2">
     <w:name w:val="List Bullet 2"/>
     <w:basedOn w:val="Normal"/>
     <w:uiPriority w:val="99"/>
@@ -3908,7 +3948,7 @@
       <w:contextualSpacing/>
     </w:pPr>
   </w:style>
-  <w:style w:type="paragraph" w:styleId="ListBullet3">
+  <w:style w:type="paragraph" w:styleId="Listaconvietas3">
     <w:name w:val="List Bullet 3"/>
     <w:basedOn w:val="Normal"/>
     <w:uiPriority w:val="99"/>
@@ -3921,7 +3961,7 @@
       <w:contextualSpacing/>
     </w:pPr>
   </w:style>
-  <w:style w:type="paragraph" w:styleId="ListNumber">
+  <w:style w:type="paragraph" w:styleId="Listaconnmeros">
     <w:name w:val="List Number"/>
     <w:basedOn w:val="Normal"/>
     <w:uiPriority w:val="99"/>
@@ -3934,7 +3974,7 @@
       <w:contextualSpacing/>
     </w:pPr>
   </w:style>
-  <w:style w:type="paragraph" w:styleId="ListNumber2">
+  <w:style w:type="paragraph" w:styleId="Listaconnmeros2">
     <w:name w:val="List Number 2"/>
     <w:basedOn w:val="Normal"/>
     <w:uiPriority w:val="99"/>
@@ -3947,7 +3987,7 @@
       <w:contextualSpacing/>
     </w:pPr>
   </w:style>
-  <w:style w:type="paragraph" w:styleId="ListNumber3">
+  <w:style w:type="paragraph" w:styleId="Listaconnmeros3">
     <w:name w:val="List Number 3"/>
     <w:basedOn w:val="Normal"/>
     <w:uiPriority w:val="99"/>
@@ -3960,7 +4000,7 @@
       <w:contextualSpacing/>
     </w:pPr>
   </w:style>
-  <w:style w:type="paragraph" w:styleId="ListContinue">
+  <w:style w:type="paragraph" w:styleId="Continuarlista">
     <w:name w:val="List Continue"/>
     <w:basedOn w:val="Normal"/>
     <w:uiPriority w:val="99"/>
@@ -3972,7 +4012,7 @@
       <w:contextualSpacing/>
     </w:pPr>
   </w:style>
-  <w:style w:type="paragraph" w:styleId="ListContinue2">
+  <w:style w:type="paragraph" w:styleId="Continuarlista2">
     <w:name w:val="List Continue 2"/>
     <w:basedOn w:val="Normal"/>
     <w:uiPriority w:val="99"/>
@@ -3984,7 +4024,7 @@
       <w:contextualSpacing/>
     </w:pPr>
   </w:style>
-  <w:style w:type="paragraph" w:styleId="ListContinue3">
+  <w:style w:type="paragraph" w:styleId="Continuarlista3">
     <w:name w:val="List Continue 3"/>
     <w:basedOn w:val="Normal"/>
     <w:uiPriority w:val="99"/>
@@ -3996,9 +4036,9 @@
       <w:contextualSpacing/>
     </w:pPr>
   </w:style>
-  <w:style w:type="paragraph" w:styleId="MacroText">
+  <w:style w:type="paragraph" w:styleId="Textomacro">
     <w:name w:val="macro"/>
-    <w:link w:val="MacroTextChar"/>
+    <w:link w:val="TextomacroCar"/>
     <w:uiPriority w:val="99"/>
     <w:unhideWhenUsed/>
     <w:qFormat/>
@@ -4021,11 +4061,11 @@
       <w:szCs w:val="20"/>
     </w:rPr>
   </w:style>
-  <w:style w:type="paragraph" w:styleId="Quote">
+  <w:style w:type="paragraph" w:styleId="Cita">
     <w:name w:val="Quote"/>
     <w:basedOn w:val="Normal"/>
     <w:next w:val="Normal"/>
-    <w:link w:val="QuoteChar"/>
+    <w:link w:val="CitaCar"/>
     <w:uiPriority w:val="29"/>
     <w:qFormat/>
     <w:rsid w:val="00FC693F"/>
@@ -4035,11 +4075,11 @@
       <w:color w:val="000000" w:themeColor="text1"/>
     </w:rPr>
   </w:style>
-  <w:style w:type="paragraph" w:styleId="IntenseQuote">
+  <w:style w:type="paragraph" w:styleId="Citadestacada">
     <w:name w:val="Intense Quote"/>
     <w:basedOn w:val="Normal"/>
     <w:next w:val="Normal"/>
-    <w:link w:val="IntenseQuoteChar"/>
+    <w:link w:val="CitadestacadaCar"/>
     <w:uiPriority w:val="30"/>
     <w:qFormat/>
     <w:rsid w:val="00FC693F"/>
@@ -4058,13 +4098,13 @@
       <w:color w:val="4F81BD" w:themeColor="accent1"/>
     </w:rPr>
   </w:style>
-  <w:style w:type="paragraph" w:styleId="IndexHeading">
+  <w:style w:type="paragraph" w:styleId="Ttulodendice">
     <w:name w:val="index heading"/>
-    <w:basedOn w:val="Ttulo"/>
-  </w:style>
-  <w:style w:type="paragraph" w:styleId="TOCHeading">
+    <w:basedOn w:val="Ttulo10"/>
+  </w:style>
+  <w:style w:type="paragraph" w:styleId="TtuloTDC">
     <w:name w:val="TOC Heading"/>
-    <w:basedOn w:val="Heading1"/>
+    <w:basedOn w:val="Ttulo1"/>
     <w:next w:val="Normal"/>
     <w:uiPriority w:val="39"/>
     <w:semiHidden/>
@@ -4082,9 +4122,9 @@
     <w:unhideWhenUsed/>
     <w:qFormat/>
   </w:style>
-  <w:style w:type="table" w:styleId="TableGrid">
+  <w:style w:type="table" w:styleId="Tablaconcuadrcula">
     <w:name w:val="Table Grid"/>
-    <w:basedOn w:val="TableNormal"/>
+    <w:basedOn w:val="Tablanormal"/>
     <w:uiPriority w:val="59"/>
     <w:rsid w:val="00FC693F"/>
     <w:tblPr>
@@ -4098,9 +4138,9 @@
       </w:tblBorders>
     </w:tblPr>
   </w:style>
-  <w:style w:type="table" w:styleId="LightShading">
+  <w:style w:type="table" w:styleId="Sombreadoclaro">
     <w:name w:val="Light Shading"/>
-    <w:basedOn w:val="TableNormal"/>
+    <w:basedOn w:val="Tablanormal"/>
     <w:uiPriority w:val="60"/>
     <w:rsid w:val="00FC693F"/>
     <w:rPr>
@@ -4191,9 +4231,9 @@
       </w:tcPr>
     </w:tblStylePr>
   </w:style>
-  <w:style w:type="table" w:styleId="LightShading-Accent1">
+  <w:style w:type="table" w:styleId="Sombreadoclaro-nfasis1">
     <w:name w:val="Light Shading Accent 1"/>
-    <w:basedOn w:val="TableNormal"/>
+    <w:basedOn w:val="Tablanormal"/>
     <w:uiPriority w:val="60"/>
     <w:rsid w:val="00FC693F"/>
     <w:rPr>
@@ -4284,9 +4324,9 @@
       </w:tcPr>
     </w:tblStylePr>
   </w:style>
-  <w:style w:type="table" w:styleId="LightShading-Accent2">
+  <w:style w:type="table" w:styleId="Sombreadoclaro-nfasis2">
     <w:name w:val="Light Shading Accent 2"/>
-    <w:basedOn w:val="TableNormal"/>
+    <w:basedOn w:val="Tablanormal"/>
     <w:uiPriority w:val="60"/>
     <w:rsid w:val="00FC693F"/>
     <w:rPr>
@@ -4377,9 +4417,9 @@
       </w:tcPr>
     </w:tblStylePr>
   </w:style>
-  <w:style w:type="table" w:styleId="LightShading-Accent3">
+  <w:style w:type="table" w:styleId="Sombreadoclaro-nfasis3">
     <w:name w:val="Light Shading Accent 3"/>
-    <w:basedOn w:val="TableNormal"/>
+    <w:basedOn w:val="Tablanormal"/>
     <w:uiPriority w:val="60"/>
     <w:rsid w:val="00FC693F"/>
     <w:rPr>
@@ -4470,9 +4510,9 @@
       </w:tcPr>
     </w:tblStylePr>
   </w:style>
-  <w:style w:type="table" w:styleId="LightShading-Accent4">
+  <w:style w:type="table" w:styleId="Sombreadoclaro-nfasis4">
     <w:name w:val="Light Shading Accent 4"/>
-    <w:basedOn w:val="TableNormal"/>
+    <w:basedOn w:val="Tablanormal"/>
     <w:uiPriority w:val="60"/>
     <w:rsid w:val="00FC693F"/>
     <w:rPr>
@@ -4563,9 +4603,9 @@
       </w:tcPr>
     </w:tblStylePr>
   </w:style>
-  <w:style w:type="table" w:styleId="LightShading-Accent5">
+  <w:style w:type="table" w:styleId="Sombreadoclaro-nfasis5">
     <w:name w:val="Light Shading Accent 5"/>
-    <w:basedOn w:val="TableNormal"/>
+    <w:basedOn w:val="Tablanormal"/>
     <w:uiPriority w:val="60"/>
     <w:rsid w:val="00FC693F"/>
     <w:rPr>
@@ -4656,9 +4696,9 @@
       </w:tcPr>
     </w:tblStylePr>
   </w:style>
-  <w:style w:type="table" w:styleId="LightShading-Accent6">
+  <w:style w:type="table" w:styleId="Sombreadoclaro-nfasis6">
     <w:name w:val="Light Shading Accent 6"/>
-    <w:basedOn w:val="TableNormal"/>
+    <w:basedOn w:val="Tablanormal"/>
     <w:uiPriority w:val="60"/>
     <w:rsid w:val="00FC693F"/>
     <w:rPr>
@@ -4749,9 +4789,9 @@
       </w:tcPr>
     </w:tblStylePr>
   </w:style>
-  <w:style w:type="table" w:styleId="LightList">
+  <w:style w:type="table" w:styleId="Listaclara">
     <w:name w:val="Light List"/>
-    <w:basedOn w:val="TableNormal"/>
+    <w:basedOn w:val="Tablanormal"/>
     <w:uiPriority w:val="61"/>
     <w:rsid w:val="00FC693F"/>
     <w:tblPr>
@@ -4831,9 +4871,9 @@
       </w:tcPr>
     </w:tblStylePr>
   </w:style>
-  <w:style w:type="table" w:styleId="LightList-Accent1">
+  <w:style w:type="table" w:styleId="Listaclara-nfasis1">
     <w:name w:val="Light List Accent 1"/>
-    <w:basedOn w:val="TableNormal"/>
+    <w:basedOn w:val="Tablanormal"/>
     <w:uiPriority w:val="61"/>
     <w:rsid w:val="00FC693F"/>
     <w:tblPr>
@@ -4913,9 +4953,9 @@
       </w:tcPr>
     </w:tblStylePr>
   </w:style>
-  <w:style w:type="table" w:styleId="LightList-Accent2">
+  <w:style w:type="table" w:styleId="Listaclara-nfasis2">
     <w:name w:val="Light List Accent 2"/>
-    <w:basedOn w:val="TableNormal"/>
+    <w:basedOn w:val="Tablanormal"/>
     <w:uiPriority w:val="61"/>
     <w:rsid w:val="00CB0664"/>
     <w:tblPr>
@@ -4995,9 +5035,9 @@
       </w:tcPr>
     </w:tblStylePr>
   </w:style>
-  <w:style w:type="table" w:styleId="LightList-Accent3">
+  <w:style w:type="table" w:styleId="Listaclara-nfasis3">
     <w:name w:val="Light List Accent 3"/>
-    <w:basedOn w:val="TableNormal"/>
+    <w:basedOn w:val="Tablanormal"/>
     <w:uiPriority w:val="61"/>
     <w:rsid w:val="00CB0664"/>
     <w:tblPr>
@@ -5077,9 +5117,9 @@
       </w:tcPr>
     </w:tblStylePr>
   </w:style>
-  <w:style w:type="table" w:styleId="LightList-Accent4">
+  <w:style w:type="table" w:styleId="Listaclara-nfasis4">
     <w:name w:val="Light List Accent 4"/>
-    <w:basedOn w:val="TableNormal"/>
+    <w:basedOn w:val="Tablanormal"/>
     <w:uiPriority w:val="61"/>
     <w:rsid w:val="00CB0664"/>
     <w:tblPr>
@@ -5159,9 +5199,9 @@
       </w:tcPr>
     </w:tblStylePr>
   </w:style>
-  <w:style w:type="table" w:styleId="LightList-Accent5">
+  <w:style w:type="table" w:styleId="Listaclara-nfasis5">
     <w:name w:val="Light List Accent 5"/>
-    <w:basedOn w:val="TableNormal"/>
+    <w:basedOn w:val="Tablanormal"/>
     <w:uiPriority w:val="61"/>
     <w:rsid w:val="00CB0664"/>
     <w:tblPr>
@@ -5241,9 +5281,9 @@
       </w:tcPr>
     </w:tblStylePr>
   </w:style>
-  <w:style w:type="table" w:styleId="LightList-Accent6">
+  <w:style w:type="table" w:styleId="Listaclara-nfasis6">
     <w:name w:val="Light List Accent 6"/>
-    <w:basedOn w:val="TableNormal"/>
+    <w:basedOn w:val="Tablanormal"/>
     <w:uiPriority w:val="61"/>
     <w:rsid w:val="00CB0664"/>
     <w:tblPr>
@@ -5323,9 +5363,9 @@
       </w:tcPr>
     </w:tblStylePr>
   </w:style>
-  <w:style w:type="table" w:styleId="LightGrid">
+  <w:style w:type="table" w:styleId="Cuadrculaclara">
     <w:name w:val="Light Grid"/>
-    <w:basedOn w:val="TableNormal"/>
+    <w:basedOn w:val="Tablanormal"/>
     <w:uiPriority w:val="62"/>
     <w:rsid w:val="00CB0664"/>
     <w:tblPr>
@@ -5443,9 +5483,9 @@
       </w:tcPr>
     </w:tblStylePr>
   </w:style>
-  <w:style w:type="table" w:styleId="LightGrid-Accent1">
+  <w:style w:type="table" w:styleId="Cuadrculaclara-nfasis1">
     <w:name w:val="Light Grid Accent 1"/>
-    <w:basedOn w:val="TableNormal"/>
+    <w:basedOn w:val="Tablanormal"/>
     <w:uiPriority w:val="62"/>
     <w:rsid w:val="00CB0664"/>
     <w:tblPr>
@@ -5563,9 +5603,9 @@
       </w:tcPr>
     </w:tblStylePr>
   </w:style>
-  <w:style w:type="table" w:styleId="LightGrid-Accent2">
+  <w:style w:type="table" w:styleId="Cuadrculaclara-nfasis2">
     <w:name w:val="Light Grid Accent 2"/>
-    <w:basedOn w:val="TableNormal"/>
+    <w:basedOn w:val="Tablanormal"/>
     <w:uiPriority w:val="62"/>
     <w:rsid w:val="00CB0664"/>
     <w:tblPr>
@@ -5683,9 +5723,9 @@
       </w:tcPr>
     </w:tblStylePr>
   </w:style>
-  <w:style w:type="table" w:styleId="LightGrid-Accent3">
+  <w:style w:type="table" w:styleId="Cuadrculaclara-nfasis3">
     <w:name w:val="Light Grid Accent 3"/>
-    <w:basedOn w:val="TableNormal"/>
+    <w:basedOn w:val="Tablanormal"/>
     <w:uiPriority w:val="62"/>
     <w:rsid w:val="00CB0664"/>
     <w:tblPr>
@@ -5803,9 +5843,9 @@
       </w:tcPr>
     </w:tblStylePr>
   </w:style>
-  <w:style w:type="table" w:styleId="LightGrid-Accent4">
+  <w:style w:type="table" w:styleId="Cuadrculaclara-nfasis4">
     <w:name w:val="Light Grid Accent 4"/>
-    <w:basedOn w:val="TableNormal"/>
+    <w:basedOn w:val="Tablanormal"/>
     <w:uiPriority w:val="62"/>
     <w:rsid w:val="00CB0664"/>
     <w:tblPr>
@@ -5923,9 +5963,9 @@
       </w:tcPr>
     </w:tblStylePr>
   </w:style>
-  <w:style w:type="table" w:styleId="LightGrid-Accent5">
+  <w:style w:type="table" w:styleId="Cuadrculaclara-nfasis5">
     <w:name w:val="Light Grid Accent 5"/>
-    <w:basedOn w:val="TableNormal"/>
+    <w:basedOn w:val="Tablanormal"/>
     <w:uiPriority w:val="62"/>
     <w:rsid w:val="00CB0664"/>
     <w:tblPr>
@@ -6043,9 +6083,9 @@
       </w:tcPr>
     </w:tblStylePr>
   </w:style>
-  <w:style w:type="table" w:styleId="LightGrid-Accent6">
+  <w:style w:type="table" w:styleId="Cuadrculaclara-nfasis6">
     <w:name w:val="Light Grid Accent 6"/>
-    <w:basedOn w:val="TableNormal"/>
+    <w:basedOn w:val="Tablanormal"/>
     <w:uiPriority w:val="62"/>
     <w:rsid w:val="00CB0664"/>
     <w:tblPr>
@@ -6163,9 +6203,9 @@
       </w:tcPr>
     </w:tblStylePr>
   </w:style>
-  <w:style w:type="table" w:styleId="MediumShading1">
+  <w:style w:type="table" w:styleId="Sombreadomedio1">
     <w:name w:val="Medium Shading 1"/>
-    <w:basedOn w:val="TableNormal"/>
+    <w:basedOn w:val="Tablanormal"/>
     <w:uiPriority w:val="63"/>
     <w:rsid w:val="00CB0664"/>
     <w:tblPr>
@@ -6259,9 +6299,9 @@
       </w:tcPr>
     </w:tblStylePr>
   </w:style>
-  <w:style w:type="table" w:styleId="MediumShading1-Accent1">
+  <w:style w:type="table" w:styleId="Sombreadomedio1-nfasis1">
     <w:name w:val="Medium Shading 1 Accent 1"/>
-    <w:basedOn w:val="TableNormal"/>
+    <w:basedOn w:val="Tablanormal"/>
     <w:uiPriority w:val="63"/>
     <w:rsid w:val="00CB0664"/>
     <w:tblPr>
@@ -6355,9 +6395,9 @@
       </w:tcPr>
     </w:tblStylePr>
   </w:style>
-  <w:style w:type="table" w:styleId="MediumShading1-Accent2">
+  <w:style w:type="table" w:styleId="Sombreadomedio1-nfasis2">
     <w:name w:val="Medium Shading 1 Accent 2"/>
-    <w:basedOn w:val="TableNormal"/>
+    <w:basedOn w:val="Tablanormal"/>
     <w:uiPriority w:val="63"/>
     <w:rsid w:val="00CB0664"/>
     <w:tblPr>
@@ -6451,9 +6491,9 @@
       </w:tcPr>
     </w:tblStylePr>
   </w:style>
-  <w:style w:type="table" w:styleId="MediumShading1-Accent3">
+  <w:style w:type="table" w:styleId="Sombreadomedio1-nfasis3">
     <w:name w:val="Medium Shading 1 Accent 3"/>
-    <w:basedOn w:val="TableNormal"/>
+    <w:basedOn w:val="Tablanormal"/>
     <w:uiPriority w:val="63"/>
     <w:rsid w:val="00CB0664"/>
     <w:tblPr>
@@ -6547,9 +6587,9 @@
       </w:tcPr>
     </w:tblStylePr>
   </w:style>
-  <w:style w:type="table" w:styleId="MediumShading1-Accent4">
+  <w:style w:type="table" w:styleId="Sombreadomedio1-nfasis4">
     <w:name w:val="Medium Shading 1 Accent 4"/>
-    <w:basedOn w:val="TableNormal"/>
+    <w:basedOn w:val="Tablanormal"/>
     <w:uiPriority w:val="63"/>
     <w:rsid w:val="00CB0664"/>
     <w:tblPr>
@@ -6643,9 +6683,9 @@
       </w:tcPr>
     </w:tblStylePr>
   </w:style>
-  <w:style w:type="table" w:styleId="MediumShading1-Accent5">
+  <w:style w:type="table" w:styleId="Sombreadomedio1-nfasis5">
     <w:name w:val="Medium Shading 1 Accent 5"/>
-    <w:basedOn w:val="TableNormal"/>
+    <w:basedOn w:val="Tablanormal"/>
     <w:uiPriority w:val="63"/>
     <w:rsid w:val="00CB0664"/>
     <w:tblPr>
@@ -6739,9 +6779,9 @@
       </w:tcPr>
     </w:tblStylePr>
   </w:style>
-  <w:style w:type="table" w:styleId="MediumShading1-Accent6">
+  <w:style w:type="table" w:styleId="Sombreadomedio1-nfasis6">
     <w:name w:val="Medium Shading 1 Accent 6"/>
-    <w:basedOn w:val="TableNormal"/>
+    <w:basedOn w:val="Tablanormal"/>
     <w:uiPriority w:val="63"/>
     <w:rsid w:val="00CB0664"/>
     <w:tblPr>
@@ -6835,9 +6875,9 @@
       </w:tcPr>
     </w:tblStylePr>
   </w:style>
-  <w:style w:type="table" w:styleId="MediumShading2">
+  <w:style w:type="table" w:styleId="Sombreadomedio2">
     <w:name w:val="Medium Shading 2"/>
-    <w:basedOn w:val="TableNormal"/>
+    <w:basedOn w:val="Tablanormal"/>
     <w:uiPriority w:val="64"/>
     <w:rsid w:val="00CB0664"/>
     <w:tblPr>
@@ -6971,9 +7011,9 @@
       </w:tcPr>
     </w:tblStylePr>
   </w:style>
-  <w:style w:type="table" w:styleId="MediumShading2-Accent1">
+  <w:style w:type="table" w:styleId="Sombreadomedio2-nfasis1">
     <w:name w:val="Medium Shading 2 Accent 1"/>
-    <w:basedOn w:val="TableNormal"/>
+    <w:basedOn w:val="Tablanormal"/>
     <w:uiPriority w:val="64"/>
     <w:rsid w:val="00CB0664"/>
     <w:tblPr>
@@ -7107,9 +7147,9 @@
       </w:tcPr>
     </w:tblStylePr>
   </w:style>
-  <w:style w:type="table" w:styleId="MediumShading2-Accent2">
+  <w:style w:type="table" w:styleId="Sombreadomedio2-nfasis2">
     <w:name w:val="Medium Shading 2 Accent 2"/>
-    <w:basedOn w:val="TableNormal"/>
+    <w:basedOn w:val="Tablanormal"/>
     <w:uiPriority w:val="64"/>
     <w:rsid w:val="00CB0664"/>
     <w:tblPr>
@@ -7243,9 +7283,9 @@
       </w:tcPr>
     </w:tblStylePr>
   </w:style>
-  <w:style w:type="table" w:styleId="MediumShading2-Accent3">
+  <w:style w:type="table" w:styleId="Sombreadomedio2-nfasis3">
     <w:name w:val="Medium Shading 2 Accent 3"/>
-    <w:basedOn w:val="TableNormal"/>
+    <w:basedOn w:val="Tablanormal"/>
     <w:uiPriority w:val="64"/>
     <w:rsid w:val="00CB0664"/>
     <w:tblPr>
@@ -7379,9 +7419,9 @@
       </w:tcPr>
     </w:tblStylePr>
   </w:style>
-  <w:style w:type="table" w:styleId="MediumShading2-Accent4">
+  <w:style w:type="table" w:styleId="Sombreadomedio2-nfasis4">
     <w:name w:val="Medium Shading 2 Accent 4"/>
-    <w:basedOn w:val="TableNormal"/>
+    <w:basedOn w:val="Tablanormal"/>
     <w:uiPriority w:val="64"/>
     <w:rsid w:val="00CB0664"/>
     <w:tblPr>
@@ -7515,9 +7555,9 @@
       </w:tcPr>
     </w:tblStylePr>
   </w:style>
-  <w:style w:type="table" w:styleId="MediumShading2-Accent5">
+  <w:style w:type="table" w:styleId="Sombreadomedio2-nfasis5">
     <w:name w:val="Medium Shading 2 Accent 5"/>
-    <w:basedOn w:val="TableNormal"/>
+    <w:basedOn w:val="Tablanormal"/>
     <w:uiPriority w:val="64"/>
     <w:rsid w:val="00CB0664"/>
     <w:tblPr>
@@ -7651,9 +7691,9 @@
       </w:tcPr>
     </w:tblStylePr>
   </w:style>
-  <w:style w:type="table" w:styleId="MediumShading2-Accent6">
+  <w:style w:type="table" w:styleId="Sombreadomedio2-nfasis6">
     <w:name w:val="Medium Shading 2 Accent 6"/>
-    <w:basedOn w:val="TableNormal"/>
+    <w:basedOn w:val="Tablanormal"/>
     <w:uiPriority w:val="64"/>
     <w:rsid w:val="00CB0664"/>
     <w:tblPr>
@@ -7787,9 +7827,9 @@
       </w:tcPr>
     </w:tblStylePr>
   </w:style>
-  <w:style w:type="table" w:styleId="MediumList1">
+  <w:style w:type="table" w:styleId="Listamedia1">
     <w:name w:val="Medium List 1"/>
-    <w:basedOn w:val="TableNormal"/>
+    <w:basedOn w:val="Tablanormal"/>
     <w:uiPriority w:val="65"/>
     <w:rsid w:val="00CB0664"/>
     <w:rPr>
@@ -7861,9 +7901,9 @@
       </w:tcPr>
     </w:tblStylePr>
   </w:style>
-  <w:style w:type="table" w:styleId="MediumList1-Accent1">
+  <w:style w:type="table" w:styleId="Listamedia1-nfasis1">
     <w:name w:val="Medium List 1 Accent 1"/>
-    <w:basedOn w:val="TableNormal"/>
+    <w:basedOn w:val="Tablanormal"/>
     <w:uiPriority w:val="65"/>
     <w:rsid w:val="00CB0664"/>
     <w:rPr>
@@ -7935,9 +7975,9 @@
       </w:tcPr>
     </w:tblStylePr>
   </w:style>
-  <w:style w:type="table" w:styleId="MediumList1-Accent2">
+  <w:style w:type="table" w:styleId="Listamedia1-nfasis2">
     <w:name w:val="Medium List 1 Accent 2"/>
-    <w:basedOn w:val="TableNormal"/>
+    <w:basedOn w:val="Tablanormal"/>
     <w:uiPriority w:val="65"/>
     <w:rsid w:val="00CB0664"/>
     <w:rPr>
@@ -8009,9 +8049,9 @@
       </w:tcPr>
     </w:tblStylePr>
   </w:style>
-  <w:style w:type="table" w:styleId="MediumList1-Accent3">
+  <w:style w:type="table" w:styleId="Listamedia1-nfasis3">
     <w:name w:val="Medium List 1 Accent 3"/>
-    <w:basedOn w:val="TableNormal"/>
+    <w:basedOn w:val="Tablanormal"/>
     <w:uiPriority w:val="65"/>
     <w:rsid w:val="00CB0664"/>
     <w:rPr>
@@ -8083,9 +8123,9 @@
       </w:tcPr>
     </w:tblStylePr>
   </w:style>
-  <w:style w:type="table" w:styleId="MediumList1-Accent4">
+  <w:style w:type="table" w:styleId="Listamedia1-nfasis4">
     <w:name w:val="Medium List 1 Accent 4"/>
-    <w:basedOn w:val="TableNormal"/>
+    <w:basedOn w:val="Tablanormal"/>
     <w:uiPriority w:val="65"/>
     <w:rsid w:val="00CB0664"/>
     <w:rPr>
@@ -8157,9 +8197,9 @@
       </w:tcPr>
     </w:tblStylePr>
   </w:style>
-  <w:style w:type="table" w:styleId="MediumList1-Accent5">
+  <w:style w:type="table" w:styleId="Listamedia1-nfasis5">
     <w:name w:val="Medium List 1 Accent 5"/>
-    <w:basedOn w:val="TableNormal"/>
+    <w:basedOn w:val="Tablanormal"/>
     <w:uiPriority w:val="65"/>
     <w:rsid w:val="00CB0664"/>
     <w:rPr>
@@ -8231,9 +8271,9 @@
       </w:tcPr>
     </w:tblStylePr>
   </w:style>
-  <w:style w:type="table" w:styleId="MediumList1-Accent6">
+  <w:style w:type="table" w:styleId="Listamedia1-nfasis6">
     <w:name w:val="Medium List 1 Accent 6"/>
-    <w:basedOn w:val="TableNormal"/>
+    <w:basedOn w:val="Tablanormal"/>
     <w:uiPriority w:val="65"/>
     <w:rsid w:val="00CB0664"/>
     <w:rPr>
@@ -8305,9 +8345,9 @@
       </w:tcPr>
     </w:tblStylePr>
   </w:style>
-  <w:style w:type="table" w:styleId="MediumList2">
+  <w:style w:type="table" w:styleId="Listamedia2">
     <w:name w:val="Medium List 2"/>
-    <w:basedOn w:val="TableNormal"/>
+    <w:basedOn w:val="Tablanormal"/>
     <w:uiPriority w:val="66"/>
     <w:rsid w:val="00CB0664"/>
     <w:rPr>
@@ -8423,9 +8463,9 @@
       </w:tcPr>
     </w:tblStylePr>
   </w:style>
-  <w:style w:type="table" w:styleId="MediumList2-Accent1">
+  <w:style w:type="table" w:styleId="Listamedia2-nfasis1">
     <w:name w:val="Medium List 2 Accent 1"/>
-    <w:basedOn w:val="TableNormal"/>
+    <w:basedOn w:val="Tablanormal"/>
     <w:uiPriority w:val="66"/>
     <w:rsid w:val="00CB0664"/>
     <w:rPr>
@@ -8541,9 +8581,9 @@
       </w:tcPr>
     </w:tblStylePr>
   </w:style>
-  <w:style w:type="table" w:styleId="MediumList2-Accent2">
+  <w:style w:type="table" w:styleId="Listamedia2-nfasis2">
     <w:name w:val="Medium List 2 Accent 2"/>
-    <w:basedOn w:val="TableNormal"/>
+    <w:basedOn w:val="Tablanormal"/>
     <w:uiPriority w:val="66"/>
     <w:rsid w:val="00CB0664"/>
     <w:rPr>
@@ -8659,9 +8699,9 @@
       </w:tcPr>
     </w:tblStylePr>
   </w:style>
-  <w:style w:type="table" w:styleId="MediumList2-Accent3">
+  <w:style w:type="table" w:styleId="Listamedia2-nfasis3">
     <w:name w:val="Medium List 2 Accent 3"/>
-    <w:basedOn w:val="TableNormal"/>
+    <w:basedOn w:val="Tablanormal"/>
     <w:uiPriority w:val="66"/>
     <w:rsid w:val="00CB0664"/>
     <w:rPr>
@@ -8777,9 +8817,9 @@
       </w:tcPr>
     </w:tblStylePr>
   </w:style>
-  <w:style w:type="table" w:styleId="MediumList2-Accent4">
+  <w:style w:type="table" w:styleId="Listamedia2-nfasis4">
     <w:name w:val="Medium List 2 Accent 4"/>
-    <w:basedOn w:val="TableNormal"/>
+    <w:basedOn w:val="Tablanormal"/>
     <w:uiPriority w:val="66"/>
     <w:rsid w:val="00CB0664"/>
     <w:rPr>
@@ -8895,9 +8935,9 @@
       </w:tcPr>
     </w:tblStylePr>
   </w:style>
-  <w:style w:type="table" w:styleId="MediumList2-Accent5">
+  <w:style w:type="table" w:styleId="Listamedia2-nfasis5">
     <w:name w:val="Medium List 2 Accent 5"/>
-    <w:basedOn w:val="TableNormal"/>
+    <w:basedOn w:val="Tablanormal"/>
     <w:uiPriority w:val="66"/>
     <w:rsid w:val="00CB0664"/>
     <w:rPr>
@@ -9013,9 +9053,9 @@
       </w:tcPr>
     </w:tblStylePr>
   </w:style>
-  <w:style w:type="table" w:styleId="MediumList2-Accent6">
+  <w:style w:type="table" w:styleId="Listamedia2-nfasis6">
     <w:name w:val="Medium List 2 Accent 6"/>
-    <w:basedOn w:val="TableNormal"/>
+    <w:basedOn w:val="Tablanormal"/>
     <w:uiPriority w:val="66"/>
     <w:rsid w:val="00CB0664"/>
     <w:rPr>
@@ -9131,9 +9171,9 @@
       </w:tcPr>
     </w:tblStylePr>
   </w:style>
-  <w:style w:type="table" w:styleId="MediumGrid1">
+  <w:style w:type="table" w:styleId="Cuadrculamedia1">
     <w:name w:val="Medium Grid 1"/>
-    <w:basedOn w:val="TableNormal"/>
+    <w:basedOn w:val="Tablanormal"/>
     <w:uiPriority w:val="67"/>
     <w:rsid w:val="00CB0664"/>
     <w:tblPr>
@@ -9194,9 +9234,9 @@
       </w:tcPr>
     </w:tblStylePr>
   </w:style>
-  <w:style w:type="table" w:styleId="MediumGrid1-Accent1">
+  <w:style w:type="table" w:styleId="Cuadrculamedia1-nfasis1">
     <w:name w:val="Medium Grid 1 Accent 1"/>
-    <w:basedOn w:val="TableNormal"/>
+    <w:basedOn w:val="Tablanormal"/>
     <w:uiPriority w:val="67"/>
     <w:rsid w:val="00CB0664"/>
     <w:tblPr>
@@ -9257,9 +9297,9 @@
       </w:tcPr>
     </w:tblStylePr>
   </w:style>
-  <w:style w:type="table" w:styleId="MediumGrid1-Accent2">
+  <w:style w:type="table" w:styleId="Cuadrculamedia1-nfasis2">
     <w:name w:val="Medium Grid 1 Accent 2"/>
-    <w:basedOn w:val="TableNormal"/>
+    <w:basedOn w:val="Tablanormal"/>
     <w:uiPriority w:val="67"/>
     <w:rsid w:val="00CB0664"/>
     <w:tblPr>
@@ -9320,9 +9360,9 @@
       </w:tcPr>
     </w:tblStylePr>
   </w:style>
-  <w:style w:type="table" w:styleId="MediumGrid1-Accent3">
+  <w:style w:type="table" w:styleId="Cuadrculamedia1-nfasis3">
     <w:name w:val="Medium Grid 1 Accent 3"/>
-    <w:basedOn w:val="TableNormal"/>
+    <w:basedOn w:val="Tablanormal"/>
     <w:uiPriority w:val="67"/>
     <w:rsid w:val="00CB0664"/>
     <w:tblPr>
@@ -9383,9 +9423,9 @@
       </w:tcPr>
     </w:tblStylePr>
   </w:style>
-  <w:style w:type="table" w:styleId="MediumGrid1-Accent4">
+  <w:style w:type="table" w:styleId="Cuadrculamedia1-nfasis4">
     <w:name w:val="Medium Grid 1 Accent 4"/>
-    <w:basedOn w:val="TableNormal"/>
+    <w:basedOn w:val="Tablanormal"/>
     <w:uiPriority w:val="67"/>
     <w:rsid w:val="00CB0664"/>
     <w:tblPr>
@@ -9446,9 +9486,9 @@
       </w:tcPr>
     </w:tblStylePr>
   </w:style>
-  <w:style w:type="table" w:styleId="MediumGrid1-Accent5">
+  <w:style w:type="table" w:styleId="Cuadrculamedia1-nfasis5">
     <w:name w:val="Medium Grid 1 Accent 5"/>
-    <w:basedOn w:val="TableNormal"/>
+    <w:basedOn w:val="Tablanormal"/>
     <w:uiPriority w:val="67"/>
     <w:rsid w:val="00CB0664"/>
     <w:tblPr>
@@ -9509,9 +9549,9 @@
       </w:tcPr>
     </w:tblStylePr>
   </w:style>
-  <w:style w:type="table" w:styleId="MediumGrid1-Accent6">
+  <w:style w:type="table" w:styleId="Cuadrculamedia1-nfasis6">
     <w:name w:val="Medium Grid 1 Accent 6"/>
-    <w:basedOn w:val="TableNormal"/>
+    <w:basedOn w:val="Tablanormal"/>
     <w:uiPriority w:val="67"/>
     <w:rsid w:val="00CB0664"/>
     <w:tblPr>
@@ -9572,9 +9612,9 @@
       </w:tcPr>
     </w:tblStylePr>
   </w:style>
-  <w:style w:type="table" w:styleId="MediumGrid2">
+  <w:style w:type="table" w:styleId="Cuadrculamedia2">
     <w:name w:val="Medium Grid 2"/>
-    <w:basedOn w:val="TableNormal"/>
+    <w:basedOn w:val="Tablanormal"/>
     <w:uiPriority w:val="68"/>
     <w:rsid w:val="00CB0664"/>
     <w:rPr>
@@ -9687,9 +9727,9 @@
       </w:tcPr>
     </w:tblStylePr>
   </w:style>
-  <w:style w:type="table" w:styleId="MediumGrid2-Accent1">
+  <w:style w:type="table" w:styleId="Cuadrculamedia2-nfasis1">
     <w:name w:val="Medium Grid 2 Accent 1"/>
-    <w:basedOn w:val="TableNormal"/>
+    <w:basedOn w:val="Tablanormal"/>
     <w:uiPriority w:val="68"/>
     <w:rsid w:val="00CB0664"/>
     <w:rPr>
@@ -9802,9 +9842,9 @@
       </w:tcPr>
     </w:tblStylePr>
   </w:style>
-  <w:style w:type="table" w:styleId="MediumGrid2-Accent2">
+  <w:style w:type="table" w:styleId="Cuadrculamedia2-nfasis2">
     <w:name w:val="Medium Grid 2 Accent 2"/>
-    <w:basedOn w:val="TableNormal"/>
+    <w:basedOn w:val="Tablanormal"/>
     <w:uiPriority w:val="68"/>
     <w:rsid w:val="00CB0664"/>
     <w:rPr>
@@ -9917,9 +9957,9 @@
       </w:tcPr>
     </w:tblStylePr>
   </w:style>
-  <w:style w:type="table" w:styleId="MediumGrid2-Accent3">
+  <w:style w:type="table" w:styleId="Cuadrculamedia2-nfasis3">
     <w:name w:val="Medium Grid 2 Accent 3"/>
-    <w:basedOn w:val="TableNormal"/>
+    <w:basedOn w:val="Tablanormal"/>
     <w:uiPriority w:val="68"/>
     <w:rsid w:val="00CB0664"/>
     <w:rPr>
@@ -10032,9 +10072,9 @@
       </w:tcPr>
     </w:tblStylePr>
   </w:style>
-  <w:style w:type="table" w:styleId="MediumGrid2-Accent4">
+  <w:style w:type="table" w:styleId="Cuadrculamedia2-nfasis4">
     <w:name w:val="Medium Grid 2 Accent 4"/>
-    <w:basedOn w:val="TableNormal"/>
+    <w:basedOn w:val="Tablanormal"/>
     <w:uiPriority w:val="68"/>
     <w:rsid w:val="00CB0664"/>
     <w:rPr>
@@ -10147,9 +10187,9 @@
       </w:tcPr>
     </w:tblStylePr>
   </w:style>
-  <w:style w:type="table" w:styleId="MediumGrid2-Accent5">
+  <w:style w:type="table" w:styleId="Cuadrculamedia2-nfasis5">
     <w:name w:val="Medium Grid 2 Accent 5"/>
-    <w:basedOn w:val="TableNormal"/>
+    <w:basedOn w:val="Tablanormal"/>
     <w:uiPriority w:val="68"/>
     <w:rsid w:val="00CB0664"/>
     <w:rPr>
@@ -10262,9 +10302,9 @@
       </w:tcPr>
     </w:tblStylePr>
   </w:style>
-  <w:style w:type="table" w:styleId="MediumGrid2-Accent6">
+  <w:style w:type="table" w:styleId="Cuadrculamedia2-nfasis6">
     <w:name w:val="Medium Grid 2 Accent 6"/>
-    <w:basedOn w:val="TableNormal"/>
+    <w:basedOn w:val="Tablanormal"/>
     <w:uiPriority w:val="68"/>
     <w:rsid w:val="00CB0664"/>
     <w:rPr>
@@ -10377,9 +10417,9 @@
       </w:tcPr>
     </w:tblStylePr>
   </w:style>
-  <w:style w:type="table" w:styleId="MediumGrid3">
+  <w:style w:type="table" w:styleId="Cuadrculamedia3">
     <w:name w:val="Medium Grid 3"/>
-    <w:basedOn w:val="TableNormal"/>
+    <w:basedOn w:val="Tablanormal"/>
     <w:uiPriority w:val="69"/>
     <w:rsid w:val="00CB0664"/>
     <w:tblPr>
@@ -10504,9 +10544,9 @@
       </w:tcPr>
     </w:tblStylePr>
   </w:style>
-  <w:style w:type="table" w:styleId="MediumGrid3-Accent1">
+  <w:style w:type="table" w:styleId="Cuadrculamedia3-nfasis1">
     <w:name w:val="Medium Grid 3 Accent 1"/>
-    <w:basedOn w:val="TableNormal"/>
+    <w:basedOn w:val="Tablanormal"/>
     <w:uiPriority w:val="69"/>
     <w:rsid w:val="00CB0664"/>
     <w:tblPr>
@@ -10631,9 +10671,9 @@
       </w:tcPr>
     </w:tblStylePr>
   </w:style>
-  <w:style w:type="table" w:styleId="MediumGrid3-Accent2">
+  <w:style w:type="table" w:styleId="Cuadrculamedia3-nfasis2">
     <w:name w:val="Medium Grid 3 Accent 2"/>
-    <w:basedOn w:val="TableNormal"/>
+    <w:basedOn w:val="Tablanormal"/>
     <w:uiPriority w:val="69"/>
     <w:rsid w:val="00CB0664"/>
     <w:tblPr>
@@ -10758,9 +10798,9 @@
       </w:tcPr>
     </w:tblStylePr>
   </w:style>
-  <w:style w:type="table" w:styleId="MediumGrid3-Accent3">
+  <w:style w:type="table" w:styleId="Cuadrculamedia3-nfasis3">
     <w:name w:val="Medium Grid 3 Accent 3"/>
-    <w:basedOn w:val="TableNormal"/>
+    <w:basedOn w:val="Tablanormal"/>
     <w:uiPriority w:val="69"/>
     <w:rsid w:val="00CB0664"/>
     <w:tblPr>
@@ -10885,9 +10925,9 @@
       </w:tcPr>
     </w:tblStylePr>
   </w:style>
-  <w:style w:type="table" w:styleId="MediumGrid3-Accent4">
+  <w:style w:type="table" w:styleId="Cuadrculamedia3-nfasis4">
     <w:name w:val="Medium Grid 3 Accent 4"/>
-    <w:basedOn w:val="TableNormal"/>
+    <w:basedOn w:val="Tablanormal"/>
     <w:uiPriority w:val="69"/>
     <w:rsid w:val="00CB0664"/>
     <w:tblPr>
@@ -11012,9 +11052,9 @@
       </w:tcPr>
     </w:tblStylePr>
   </w:style>
-  <w:style w:type="table" w:styleId="MediumGrid3-Accent5">
+  <w:style w:type="table" w:styleId="Cuadrculamedia3-nfasis5">
     <w:name w:val="Medium Grid 3 Accent 5"/>
-    <w:basedOn w:val="TableNormal"/>
+    <w:basedOn w:val="Tablanormal"/>
     <w:uiPriority w:val="69"/>
     <w:rsid w:val="00CB0664"/>
     <w:tblPr>
@@ -11139,9 +11179,9 @@
       </w:tcPr>
     </w:tblStylePr>
   </w:style>
-  <w:style w:type="table" w:styleId="MediumGrid3-Accent6">
+  <w:style w:type="table" w:styleId="Cuadrculamedia3-nfasis6">
     <w:name w:val="Medium Grid 3 Accent 6"/>
-    <w:basedOn w:val="TableNormal"/>
+    <w:basedOn w:val="Tablanormal"/>
     <w:uiPriority w:val="69"/>
     <w:rsid w:val="00CB0664"/>
     <w:tblPr>
@@ -11266,9 +11306,9 @@
       </w:tcPr>
     </w:tblStylePr>
   </w:style>
-  <w:style w:type="table" w:styleId="DarkList">
+  <w:style w:type="table" w:styleId="Listaoscura">
     <w:name w:val="Dark List"/>
-    <w:basedOn w:val="TableNormal"/>
+    <w:basedOn w:val="Tablanormal"/>
     <w:uiPriority w:val="70"/>
     <w:rsid w:val="00CB0664"/>
     <w:rPr>
@@ -11370,9 +11410,9 @@
       </w:tcPr>
     </w:tblStylePr>
   </w:style>
-  <w:style w:type="table" w:styleId="DarkList-Accent1">
+  <w:style w:type="table" w:styleId="Listaoscura-nfasis1">
     <w:name w:val="Dark List Accent 1"/>
-    <w:basedOn w:val="TableNormal"/>
+    <w:basedOn w:val="Tablanormal"/>
     <w:uiPriority w:val="70"/>
     <w:rsid w:val="00CB0664"/>
     <w:rPr>
@@ -11474,9 +11514,9 @@
       </w:tcPr>
     </w:tblStylePr>
   </w:style>
-  <w:style w:type="table" w:styleId="DarkList-Accent2">
+  <w:style w:type="table" w:styleId="Listaoscura-nfasis2">
     <w:name w:val="Dark List Accent 2"/>
-    <w:basedOn w:val="TableNormal"/>
+    <w:basedOn w:val="Tablanormal"/>
     <w:uiPriority w:val="70"/>
     <w:rsid w:val="00CB0664"/>
     <w:rPr>
@@ -11578,9 +11618,9 @@
       </w:tcPr>
     </w:tblStylePr>
   </w:style>
-  <w:style w:type="table" w:styleId="DarkList-Accent3">
+  <w:style w:type="table" w:styleId="Listaoscura-nfasis3">
     <w:name w:val="Dark List Accent 3"/>
-    <w:basedOn w:val="TableNormal"/>
+    <w:basedOn w:val="Tablanormal"/>
     <w:uiPriority w:val="70"/>
     <w:rsid w:val="00CB0664"/>
     <w:rPr>
@@ -11682,9 +11722,9 @@
       </w:tcPr>
     </w:tblStylePr>
   </w:style>
-  <w:style w:type="table" w:styleId="DarkList-Accent4">
+  <w:style w:type="table" w:styleId="Listaoscura-nfasis4">
     <w:name w:val="Dark List Accent 4"/>
-    <w:basedOn w:val="TableNormal"/>
+    <w:basedOn w:val="Tablanormal"/>
     <w:uiPriority w:val="70"/>
     <w:rsid w:val="00CB0664"/>
     <w:rPr>
@@ -11786,9 +11826,9 @@
       </w:tcPr>
     </w:tblStylePr>
   </w:style>
-  <w:style w:type="table" w:styleId="DarkList-Accent5">
+  <w:style w:type="table" w:styleId="Listaoscura-nfasis5">
     <w:name w:val="Dark List Accent 5"/>
-    <w:basedOn w:val="TableNormal"/>
+    <w:basedOn w:val="Tablanormal"/>
     <w:uiPriority w:val="70"/>
     <w:rsid w:val="00CB0664"/>
     <w:rPr>
@@ -11890,9 +11930,9 @@
       </w:tcPr>
     </w:tblStylePr>
   </w:style>
-  <w:style w:type="table" w:styleId="DarkList-Accent6">
+  <w:style w:type="table" w:styleId="Listaoscura-nfasis6">
     <w:name w:val="Dark List Accent 6"/>
-    <w:basedOn w:val="TableNormal"/>
+    <w:basedOn w:val="Tablanormal"/>
     <w:uiPriority w:val="70"/>
     <w:rsid w:val="00CB0664"/>
     <w:rPr>
@@ -11994,9 +12034,9 @@
       </w:tcPr>
     </w:tblStylePr>
   </w:style>
-  <w:style w:type="table" w:styleId="ColorfulShading">
+  <w:style w:type="table" w:styleId="Sombreadovistoso">
     <w:name w:val="Colorful Shading"/>
-    <w:basedOn w:val="TableNormal"/>
+    <w:basedOn w:val="Tablanormal"/>
     <w:uiPriority w:val="71"/>
     <w:rsid w:val="00CB0664"/>
     <w:rPr>
@@ -12106,9 +12146,9 @@
       </w:rPr>
     </w:tblStylePr>
   </w:style>
-  <w:style w:type="table" w:styleId="ColorfulShading-Accent1">
+  <w:style w:type="table" w:styleId="Sombreadovistoso-nfasis1">
     <w:name w:val="Colorful Shading Accent 1"/>
-    <w:basedOn w:val="TableNormal"/>
+    <w:basedOn w:val="Tablanormal"/>
     <w:uiPriority w:val="71"/>
     <w:rsid w:val="00CB0664"/>
     <w:rPr>
@@ -12218,9 +12258,9 @@
       </w:rPr>
     </w:tblStylePr>
   </w:style>
-  <w:style w:type="table" w:styleId="ColorfulShading-Accent2">
+  <w:style w:type="table" w:styleId="Sombreadovistoso-nfasis2">
     <w:name w:val="Colorful Shading Accent 2"/>
-    <w:basedOn w:val="TableNormal"/>
+    <w:basedOn w:val="Tablanormal"/>
     <w:uiPriority w:val="71"/>
     <w:rsid w:val="00CB0664"/>
     <w:rPr>
@@ -12330,9 +12370,9 @@
       </w:rPr>
     </w:tblStylePr>
   </w:style>
-  <w:style w:type="table" w:styleId="ColorfulShading-Accent3">
+  <w:style w:type="table" w:styleId="Sombreadovistoso-nfasis3">
     <w:name w:val="Colorful Shading Accent 3"/>
-    <w:basedOn w:val="TableNormal"/>
+    <w:basedOn w:val="Tablanormal"/>
     <w:uiPriority w:val="71"/>
     <w:rsid w:val="00CB0664"/>
     <w:rPr>
@@ -12432,9 +12472,9 @@
       </w:tcPr>
     </w:tblStylePr>
   </w:style>
-  <w:style w:type="table" w:styleId="ColorfulShading-Accent4">
+  <w:style w:type="table" w:styleId="Sombreadovistoso-nfasis4">
     <w:name w:val="Colorful Shading Accent 4"/>
-    <w:basedOn w:val="TableNormal"/>
+    <w:basedOn w:val="Tablanormal"/>
     <w:uiPriority w:val="71"/>
     <w:rsid w:val="00CB0664"/>
     <w:rPr>
@@ -12544,9 +12584,9 @@
       </w:rPr>
     </w:tblStylePr>
   </w:style>
-  <w:style w:type="table" w:styleId="ColorfulShading-Accent5">
+  <w:style w:type="table" w:styleId="Sombreadovistoso-nfasis5">
     <w:name w:val="Colorful Shading Accent 5"/>
-    <w:basedOn w:val="TableNormal"/>
+    <w:basedOn w:val="Tablanormal"/>
     <w:uiPriority w:val="71"/>
     <w:rsid w:val="00CB0664"/>
     <w:rPr>
@@ -12656,9 +12696,9 @@
       </w:rPr>
     </w:tblStylePr>
   </w:style>
-  <w:style w:type="table" w:styleId="ColorfulShading-Accent6">
+  <w:style w:type="table" w:styleId="Sombreadovistoso-nfasis6">
     <w:name w:val="Colorful Shading Accent 6"/>
-    <w:basedOn w:val="TableNormal"/>
+    <w:basedOn w:val="Tablanormal"/>
     <w:uiPriority w:val="71"/>
     <w:rsid w:val="00CB0664"/>
     <w:rPr>
@@ -12768,9 +12808,9 @@
       </w:rPr>
     </w:tblStylePr>
   </w:style>
-  <w:style w:type="table" w:styleId="ColorfulList">
+  <w:style w:type="table" w:styleId="Listavistosa">
     <w:name w:val="Colorful List"/>
-    <w:basedOn w:val="TableNormal"/>
+    <w:basedOn w:val="Tablanormal"/>
     <w:uiPriority w:val="72"/>
     <w:rsid w:val="00CB0664"/>
     <w:rPr>
@@ -12844,9 +12884,9 @@
       </w:tcPr>
     </w:tblStylePr>
   </w:style>
-  <w:style w:type="table" w:styleId="ColorfulList-Accent1">
+  <w:style w:type="table" w:styleId="Listavistosa-nfasis1">
     <w:name w:val="Colorful List Accent 1"/>
-    <w:basedOn w:val="TableNormal"/>
+    <w:basedOn w:val="Tablanormal"/>
     <w:uiPriority w:val="72"/>
     <w:rsid w:val="00CB0664"/>
     <w:rPr>
@@ -12920,9 +12960,9 @@
       </w:tcPr>
     </w:tblStylePr>
   </w:style>
-  <w:style w:type="table" w:styleId="ColorfulList-Accent2">
+  <w:style w:type="table" w:styleId="Listavistosa-nfasis2">
     <w:name w:val="Colorful List Accent 2"/>
-    <w:basedOn w:val="TableNormal"/>
+    <w:basedOn w:val="Tablanormal"/>
     <w:uiPriority w:val="72"/>
     <w:rsid w:val="00CB0664"/>
     <w:rPr>
@@ -12996,9 +13036,9 @@
       </w:tcPr>
     </w:tblStylePr>
   </w:style>
-  <w:style w:type="table" w:styleId="ColorfulList-Accent3">
+  <w:style w:type="table" w:styleId="Listavistosa-nfasis3">
     <w:name w:val="Colorful List Accent 3"/>
-    <w:basedOn w:val="TableNormal"/>
+    <w:basedOn w:val="Tablanormal"/>
     <w:uiPriority w:val="72"/>
     <w:rsid w:val="00CB0664"/>
     <w:rPr>
@@ -13072,9 +13112,9 @@
       </w:tcPr>
     </w:tblStylePr>
   </w:style>
-  <w:style w:type="table" w:styleId="ColorfulList-Accent4">
+  <w:style w:type="table" w:styleId="Listavistosa-nfasis4">
     <w:name w:val="Colorful List Accent 4"/>
-    <w:basedOn w:val="TableNormal"/>
+    <w:basedOn w:val="Tablanormal"/>
     <w:uiPriority w:val="72"/>
     <w:rsid w:val="00CB0664"/>
     <w:rPr>
@@ -13148,9 +13188,9 @@
       </w:tcPr>
     </w:tblStylePr>
   </w:style>
-  <w:style w:type="table" w:styleId="ColorfulList-Accent5">
+  <w:style w:type="table" w:styleId="Listavistosa-nfasis5">
     <w:name w:val="Colorful List Accent 5"/>
-    <w:basedOn w:val="TableNormal"/>
+    <w:basedOn w:val="Tablanormal"/>
     <w:uiPriority w:val="72"/>
     <w:rsid w:val="00CB0664"/>
     <w:rPr>
@@ -13224,9 +13264,9 @@
       </w:tcPr>
     </w:tblStylePr>
   </w:style>
-  <w:style w:type="table" w:styleId="ColorfulList-Accent6">
+  <w:style w:type="table" w:styleId="Listavistosa-nfasis6">
     <w:name w:val="Colorful List Accent 6"/>
-    <w:basedOn w:val="TableNormal"/>
+    <w:basedOn w:val="Tablanormal"/>
     <w:uiPriority w:val="72"/>
     <w:rsid w:val="00CB0664"/>
     <w:rPr>
@@ -13300,9 +13340,9 @@
       </w:tcPr>
     </w:tblStylePr>
   </w:style>
-  <w:style w:type="table" w:styleId="ColorfulGrid">
+  <w:style w:type="table" w:styleId="Cuadrculavistosa">
     <w:name w:val="Colorful Grid"/>
-    <w:basedOn w:val="TableNormal"/>
+    <w:basedOn w:val="Tablanormal"/>
     <w:uiPriority w:val="73"/>
     <w:rsid w:val="00CB0664"/>
     <w:rPr>
@@ -13370,9 +13410,9 @@
       </w:tcPr>
     </w:tblStylePr>
   </w:style>
-  <w:style w:type="table" w:styleId="ColorfulGrid-Accent1">
+  <w:style w:type="table" w:styleId="Cuadrculavistosa-nfasis1">
     <w:name w:val="Colorful Grid Accent 1"/>
-    <w:basedOn w:val="TableNormal"/>
+    <w:basedOn w:val="Tablanormal"/>
     <w:uiPriority w:val="73"/>
     <w:rsid w:val="00CB0664"/>
     <w:rPr>
@@ -13440,9 +13480,9 @@
       </w:tcPr>
     </w:tblStylePr>
   </w:style>
-  <w:style w:type="table" w:styleId="ColorfulGrid-Accent2">
+  <w:style w:type="table" w:styleId="Cuadrculavistosa-nfasis2">
     <w:name w:val="Colorful Grid Accent 2"/>
-    <w:basedOn w:val="TableNormal"/>
+    <w:basedOn w:val="Tablanormal"/>
     <w:uiPriority w:val="73"/>
     <w:rsid w:val="00CB0664"/>
     <w:rPr>
@@ -13510,9 +13550,9 @@
       </w:tcPr>
     </w:tblStylePr>
   </w:style>
-  <w:style w:type="table" w:styleId="ColorfulGrid-Accent3">
+  <w:style w:type="table" w:styleId="Cuadrculavistosa-nfasis3">
     <w:name w:val="Colorful Grid Accent 3"/>
-    <w:basedOn w:val="TableNormal"/>
+    <w:basedOn w:val="Tablanormal"/>
     <w:uiPriority w:val="73"/>
     <w:rsid w:val="00CB0664"/>
     <w:rPr>
@@ -13580,9 +13620,9 @@
       </w:tcPr>
     </w:tblStylePr>
   </w:style>
-  <w:style w:type="table" w:styleId="ColorfulGrid-Accent4">
+  <w:style w:type="table" w:styleId="Cuadrculavistosa-nfasis4">
     <w:name w:val="Colorful Grid Accent 4"/>
-    <w:basedOn w:val="TableNormal"/>
+    <w:basedOn w:val="Tablanormal"/>
     <w:uiPriority w:val="73"/>
     <w:rsid w:val="00CB0664"/>
     <w:rPr>
@@ -13650,9 +13690,9 @@
       </w:tcPr>
     </w:tblStylePr>
   </w:style>
-  <w:style w:type="table" w:styleId="ColorfulGrid-Accent5">
+  <w:style w:type="table" w:styleId="Cuadrculavistosa-nfasis5">
     <w:name w:val="Colorful Grid Accent 5"/>
-    <w:basedOn w:val="TableNormal"/>
+    <w:basedOn w:val="Tablanormal"/>
     <w:uiPriority w:val="73"/>
     <w:rsid w:val="00CB0664"/>
     <w:rPr>
@@ -13720,9 +13760,9 @@
       </w:tcPr>
     </w:tblStylePr>
   </w:style>
-  <w:style w:type="table" w:styleId="ColorfulGrid-Accent6">
+  <w:style w:type="table" w:styleId="Cuadrculavistosa-nfasis6">
     <w:name w:val="Colorful Grid Accent 6"/>
-    <w:basedOn w:val="TableNormal"/>
+    <w:basedOn w:val="Tablanormal"/>
     <w:uiPriority w:val="73"/>
     <w:rsid w:val="00CB0664"/>
     <w:rPr>

</xml_diff>